<commit_message>
Update AXA DOCX with python-docx 1.2.0 compatibility fixes
Replaced RGBColor.from_string() with direct RGB constructor,
fixed Cm() EMU-to-twips conversion.

https://claude.ai/code/session_014RzVhKjh1Tf1rPzKrQUfgF
</commit_message>
<xml_diff>
--- a/UPN_Wechsel_AXA.docx
+++ b/UPN_Wechsel_AXA.docx
@@ -4,8 +4,6 @@
   <w:body>
     <w:tbl>
       <w:tblPr>
-        <w:tblStyle w:val="TableGrid"/>
-        <w:tblW w:type="auto" w:w="0"/>
         <w:jc w:val="left"/>
         <w:tblLook w:firstColumn="1" w:firstRow="1" w:lastColumn="0" w:lastRow="0" w:noHBand="0" w:noVBand="1" w:val="04A0"/>
         <w:tblBorders>
@@ -16,6 +14,7 @@
           <w:insideH w:val="none" w:sz="0" w:space="0" w:color="auto"/>
           <w:insideV w:val="none" w:sz="0" w:space="0" w:color="auto"/>
         </w:tblBorders>
+        <w:tblW w:w="10544" w:type="dxa"/>
       </w:tblPr>
       <w:tblGrid>
         <w:gridCol w:w="5273"/>
@@ -24,7 +23,7 @@
       <w:tr>
         <w:tc>
           <w:tcPr>
-            <w:tcW w:type="dxa" w:w="8504"/>
+            <w:tcW w:w="8503" w:type="dxa"/>
             <w:shd w:val="clear" w:color="auto" w:fill="00008F"/>
             <w:tcMar>
               <w:top w:w="80" w:type="dxa"/>
@@ -36,7 +35,7 @@
           </w:tcPr>
           <w:p>
             <w:pPr>
-              <w:spacing w:before="0" w:after="0" w:line="240" w:lineRule="exact"/>
+              <w:spacing w:before="0" w:after="0"/>
               <w:jc w:val="left"/>
             </w:pPr>
             <w:r>
@@ -72,7 +71,7 @@
           </w:p>
           <w:p>
             <w:pPr>
-              <w:spacing w:before="40" w:after="0" w:line="240" w:lineRule="exact"/>
+              <w:spacing w:before="40" w:after="0"/>
               <w:jc w:val="left"/>
             </w:pPr>
             <w:r>
@@ -89,7 +88,7 @@
         </w:tc>
         <w:tc>
           <w:tcPr>
-            <w:tcW w:type="dxa" w:w="2041"/>
+            <w:tcW w:w="2040" w:type="dxa"/>
             <w:shd w:val="clear" w:color="auto" w:fill="00008F"/>
             <w:tcMar>
               <w:top w:w="80" w:type="dxa"/>
@@ -101,7 +100,7 @@
           </w:tcPr>
           <w:p>
             <w:pPr>
-              <w:spacing w:before="0" w:after="0" w:line="240" w:lineRule="exact"/>
+              <w:spacing w:before="0" w:after="0"/>
               <w:jc w:val="right"/>
             </w:pPr>
             <w:r>
@@ -120,9 +119,6 @@
     </w:tbl>
     <w:tbl>
       <w:tblPr>
-        <w:tblStyle w:val="TableGrid"/>
-        <w:tblW w:type="auto" w:w="0"/>
-        <w:jc w:val="left"/>
         <w:tblLook w:firstColumn="1" w:firstRow="1" w:lastColumn="0" w:lastRow="0" w:noHBand="0" w:noVBand="1" w:val="04A0"/>
         <w:tblBorders>
           <w:top w:val="none" w:sz="0" w:space="0" w:color="auto"/>
@@ -132,6 +128,7 @@
           <w:insideH w:val="none" w:sz="0" w:space="0" w:color="auto"/>
           <w:insideV w:val="none" w:sz="0" w:space="0" w:color="auto"/>
         </w:tblBorders>
+        <w:tblW w:w="10544" w:type="dxa"/>
       </w:tblPr>
       <w:tblGrid>
         <w:gridCol w:w="10546"/>
@@ -153,15 +150,14 @@
           </w:tcPr>
           <w:p>
             <w:pPr>
-              <w:spacing w:before="0" w:after="0" w:line="240" w:lineRule="exact"/>
+              <w:spacing w:before="0" w:after="0"/>
+              <w:jc w:val="left"/>
             </w:pPr>
             <w:r>
               <w:rPr>
-                <w:rFonts w:ascii="Arial" w:hAnsi="Arial"/>
-                <w:b w:val="0"/>
-                <w:i w:val="0"/>
-                <w:sz w:val="4"/>
+                <w:sz w:val="2"/>
               </w:rPr>
+              <w:t xml:space="preserve"> </w:t>
             </w:r>
           </w:p>
         </w:tc>
@@ -169,20 +165,14 @@
     </w:tbl>
     <w:p>
       <w:pPr>
-        <w:spacing w:before="0" w:after="0" w:line="60" w:lineRule="exact"/>
+        <w:spacing w:line="60" w:lineRule="exact"/>
+        <w:rPr>
+          <w:sz w:val="2"/>
+        </w:rPr>
       </w:pPr>
-      <w:r>
-        <w:rPr>
-          <w:rFonts w:ascii="Arial" w:hAnsi="Arial"/>
-          <w:sz w:val="6"/>
-        </w:rPr>
-      </w:r>
     </w:p>
     <w:tbl>
       <w:tblPr>
-        <w:tblStyle w:val="TableGrid"/>
-        <w:tblW w:type="auto" w:w="0"/>
-        <w:jc w:val="left"/>
         <w:tblLook w:firstColumn="1" w:firstRow="1" w:lastColumn="0" w:lastRow="0" w:noHBand="0" w:noVBand="1" w:val="04A0"/>
         <w:tblBorders>
           <w:top w:val="single" w:sz="4" w:space="0" w:color="CCCCCC"/>
@@ -192,6 +182,7 @@
           <w:insideH w:val="none" w:sz="0" w:space="0" w:color="auto"/>
           <w:insideV w:val="none" w:sz="0" w:space="0" w:color="auto"/>
         </w:tblBorders>
+        <w:tblW w:w="10544" w:type="dxa"/>
       </w:tblPr>
       <w:tblGrid>
         <w:gridCol w:w="10546"/>
@@ -202,15 +193,15 @@
             <w:tcW w:type="dxa" w:w="10546"/>
             <w:shd w:val="clear" w:color="auto" w:fill="F5F5F5"/>
             <w:tcMar>
-              <w:top w:w="100" w:type="dxa"/>
-              <w:bottom w:w="100" w:type="dxa"/>
+              <w:top w:w="80" w:type="dxa"/>
+              <w:bottom w:w="80" w:type="dxa"/>
               <w:left w:w="120" w:type="dxa"/>
               <w:right w:w="120" w:type="dxa"/>
             </w:tcMar>
           </w:tcPr>
           <w:p>
             <w:pPr>
-              <w:spacing w:before="0" w:after="0" w:line="240" w:lineRule="exact"/>
+              <w:spacing w:before="0" w:after="0"/>
               <w:jc w:val="both"/>
             </w:pPr>
             <w:r>
@@ -249,20 +240,14 @@
     </w:tbl>
     <w:p>
       <w:pPr>
-        <w:spacing w:before="0" w:after="0" w:line="80" w:lineRule="exact"/>
+        <w:spacing w:line="80" w:lineRule="exact"/>
+        <w:rPr>
+          <w:sz w:val="2"/>
+        </w:rPr>
       </w:pPr>
-      <w:r>
-        <w:rPr>
-          <w:rFonts w:ascii="Arial" w:hAnsi="Arial"/>
-          <w:sz w:val="8"/>
-        </w:rPr>
-      </w:r>
     </w:p>
     <w:tbl>
       <w:tblPr>
-        <w:tblStyle w:val="TableGrid"/>
-        <w:tblW w:type="auto" w:w="0"/>
-        <w:jc w:val="left"/>
         <w:tblLook w:firstColumn="1" w:firstRow="1" w:lastColumn="0" w:lastRow="0" w:noHBand="0" w:noVBand="1" w:val="04A0"/>
         <w:tblBorders>
           <w:top w:val="none" w:sz="0" w:space="0" w:color="auto"/>
@@ -272,6 +257,7 @@
           <w:insideH w:val="none" w:sz="0" w:space="0" w:color="auto"/>
           <w:insideV w:val="none" w:sz="0" w:space="0" w:color="auto"/>
         </w:tblBorders>
+        <w:tblW w:w="10544" w:type="dxa"/>
       </w:tblPr>
       <w:tblGrid>
         <w:gridCol w:w="10546"/>
@@ -282,15 +268,15 @@
             <w:tcW w:type="dxa" w:w="10546"/>
             <w:shd w:val="clear" w:color="auto" w:fill="00008F"/>
             <w:tcMar>
-              <w:top w:w="80" w:type="dxa"/>
-              <w:bottom w:w="80" w:type="dxa"/>
+              <w:top w:w="70" w:type="dxa"/>
+              <w:bottom w:w="70" w:type="dxa"/>
               <w:left w:w="120" w:type="dxa"/>
               <w:right w:w="120" w:type="dxa"/>
             </w:tcMar>
           </w:tcPr>
           <w:p>
             <w:pPr>
-              <w:spacing w:before="0" w:after="0" w:line="240" w:lineRule="exact"/>
+              <w:spacing w:before="0" w:after="0"/>
               <w:jc w:val="left"/>
             </w:pPr>
             <w:r>
@@ -309,9 +295,6 @@
     </w:tbl>
     <w:tbl>
       <w:tblPr>
-        <w:tblStyle w:val="TableGrid"/>
-        <w:tblW w:type="auto" w:w="0"/>
-        <w:jc w:val="left"/>
         <w:tblLook w:firstColumn="1" w:firstRow="1" w:lastColumn="0" w:lastRow="0" w:noHBand="0" w:noVBand="1" w:val="04A0"/>
         <w:tblBorders>
           <w:top w:val="single" w:sz="4" w:space="0" w:color="BBBBE8"/>
@@ -321,6 +304,7 @@
           <w:insideH w:val="none" w:sz="0" w:space="0" w:color="auto"/>
           <w:insideV w:val="none" w:sz="0" w:space="0" w:color="auto"/>
         </w:tblBorders>
+        <w:tblW w:w="10544" w:type="dxa"/>
       </w:tblPr>
       <w:tblGrid>
         <w:gridCol w:w="5273"/>
@@ -329,18 +313,19 @@
       <w:tr>
         <w:tc>
           <w:tcPr>
-            <w:tcW w:type="dxa" w:w="6236"/>
+            <w:tcW w:w="6236" w:type="dxa"/>
             <w:shd w:val="clear" w:color="auto" w:fill="EEEEF8"/>
             <w:tcMar>
-              <w:top w:w="100" w:type="dxa"/>
-              <w:bottom w:w="100" w:type="dxa"/>
+              <w:top w:w="80" w:type="dxa"/>
+              <w:bottom w:w="80" w:type="dxa"/>
               <w:left w:w="120" w:type="dxa"/>
               <w:right w:w="80" w:type="dxa"/>
             </w:tcMar>
+            <w:vAlign w:val="top"/>
           </w:tcPr>
           <w:p>
             <w:pPr>
-              <w:spacing w:before="80" w:after="0" w:line="240" w:lineRule="exact"/>
+              <w:spacing w:before="80" w:after="0"/>
               <w:jc w:val="left"/>
             </w:pPr>
             <w:r>
@@ -358,7 +343,7 @@
                 <w:rFonts w:ascii="Arial" w:hAnsi="Arial"/>
                 <w:b/>
                 <w:i w:val="0"/>
-                <w:color w:val="343C3D"/>
+                <w:color w:val="FF1721"/>
                 <w:sz w:val="18"/>
               </w:rPr>
               <w:t>Vor dem Schließen: Sync-Fehler prüfen</w:t>
@@ -366,7 +351,7 @@
           </w:p>
           <w:p>
             <w:pPr>
-              <w:spacing w:before="0" w:after="40" w:line="240" w:lineRule="exact"/>
+              <w:spacing w:before="0" w:after="40"/>
               <w:ind w:left="340"/>
               <w:jc w:val="left"/>
             </w:pPr>
@@ -383,7 +368,7 @@
           </w:p>
           <w:p>
             <w:pPr>
-              <w:spacing w:before="80" w:after="0" w:line="240" w:lineRule="exact"/>
+              <w:spacing w:before="80" w:after="0"/>
               <w:jc w:val="left"/>
             </w:pPr>
             <w:r>
@@ -409,7 +394,7 @@
           </w:p>
           <w:p>
             <w:pPr>
-              <w:spacing w:before="0" w:after="40" w:line="240" w:lineRule="exact"/>
+              <w:spacing w:before="0" w:after="40"/>
               <w:ind w:left="340"/>
               <w:jc w:val="left"/>
             </w:pPr>
@@ -426,7 +411,7 @@
           </w:p>
           <w:p>
             <w:pPr>
-              <w:spacing w:before="80" w:after="0" w:line="240" w:lineRule="exact"/>
+              <w:spacing w:before="80" w:after="0"/>
               <w:jc w:val="left"/>
             </w:pPr>
             <w:r>
@@ -452,7 +437,7 @@
           </w:p>
           <w:p>
             <w:pPr>
-              <w:spacing w:before="0" w:after="40" w:line="240" w:lineRule="exact"/>
+              <w:spacing w:before="0" w:after="40"/>
               <w:ind w:left="340"/>
               <w:jc w:val="left"/>
             </w:pPr>
@@ -469,7 +454,7 @@
           </w:p>
           <w:p>
             <w:pPr>
-              <w:spacing w:before="80" w:after="0" w:line="240" w:lineRule="exact"/>
+              <w:spacing w:before="80" w:after="0"/>
               <w:jc w:val="left"/>
             </w:pPr>
             <w:r>
@@ -495,7 +480,7 @@
           </w:p>
           <w:p>
             <w:pPr>
-              <w:spacing w:before="0" w:after="40" w:line="240" w:lineRule="exact"/>
+              <w:spacing w:before="0" w:after="40"/>
               <w:ind w:left="340"/>
               <w:jc w:val="left"/>
             </w:pPr>
@@ -512,7 +497,7 @@
           </w:p>
           <w:p>
             <w:pPr>
-              <w:spacing w:before="80" w:after="0" w:line="240" w:lineRule="exact"/>
+              <w:spacing w:before="80" w:after="0"/>
               <w:jc w:val="left"/>
             </w:pPr>
             <w:r>
@@ -538,7 +523,7 @@
           </w:p>
           <w:p>
             <w:pPr>
-              <w:spacing w:before="0" w:after="40" w:line="240" w:lineRule="exact"/>
+              <w:spacing w:before="0" w:after="40"/>
               <w:ind w:left="340"/>
               <w:jc w:val="left"/>
             </w:pPr>
@@ -556,11 +541,11 @@
         </w:tc>
         <w:tc>
           <w:tcPr>
-            <w:tcW w:type="dxa" w:w="4309"/>
+            <w:tcW w:w="4308" w:type="dxa"/>
             <w:shd w:val="clear" w:color="auto" w:fill="EEEEF8"/>
             <w:tcMar>
-              <w:top w:w="100" w:type="dxa"/>
-              <w:bottom w:w="100" w:type="dxa"/>
+              <w:top w:w="80" w:type="dxa"/>
+              <w:bottom w:w="80" w:type="dxa"/>
               <w:left w:w="80" w:type="dxa"/>
               <w:right w:w="80" w:type="dxa"/>
             </w:tcMar>
@@ -568,7 +553,7 @@
           </w:tcPr>
           <w:p>
             <w:pPr>
-              <w:spacing w:before="0" w:after="80" w:line="240" w:lineRule="exact"/>
+              <w:spacing w:before="0" w:after="0"/>
               <w:jc w:val="center"/>
             </w:pPr>
             <w:r>
@@ -608,7 +593,7 @@
           </w:p>
           <w:p>
             <w:pPr>
-              <w:spacing w:before="40" w:after="0" w:line="240" w:lineRule="exact"/>
+              <w:spacing w:before="80" w:after="0"/>
               <w:jc w:val="center"/>
             </w:pPr>
             <w:r>
@@ -627,20 +612,14 @@
     </w:tbl>
     <w:p>
       <w:pPr>
-        <w:spacing w:before="0" w:after="0" w:line="80" w:lineRule="exact"/>
+        <w:spacing w:line="80" w:lineRule="exact"/>
+        <w:rPr>
+          <w:sz w:val="2"/>
+        </w:rPr>
       </w:pPr>
-      <w:r>
-        <w:rPr>
-          <w:rFonts w:ascii="Arial" w:hAnsi="Arial"/>
-          <w:sz w:val="8"/>
-        </w:rPr>
-      </w:r>
     </w:p>
     <w:tbl>
       <w:tblPr>
-        <w:tblStyle w:val="TableGrid"/>
-        <w:tblW w:type="auto" w:w="0"/>
-        <w:jc w:val="left"/>
         <w:tblLook w:firstColumn="1" w:firstRow="1" w:lastColumn="0" w:lastRow="0" w:noHBand="0" w:noVBand="1" w:val="04A0"/>
         <w:tblBorders>
           <w:top w:val="none" w:sz="0" w:space="0" w:color="auto"/>
@@ -650,6 +629,7 @@
           <w:insideH w:val="none" w:sz="0" w:space="0" w:color="auto"/>
           <w:insideV w:val="none" w:sz="0" w:space="0" w:color="auto"/>
         </w:tblBorders>
+        <w:tblW w:w="10544" w:type="dxa"/>
       </w:tblPr>
       <w:tblGrid>
         <w:gridCol w:w="10546"/>
@@ -660,15 +640,15 @@
             <w:tcW w:type="dxa" w:w="10546"/>
             <w:shd w:val="clear" w:color="auto" w:fill="00008F"/>
             <w:tcMar>
-              <w:top w:w="80" w:type="dxa"/>
-              <w:bottom w:w="80" w:type="dxa"/>
+              <w:top w:w="70" w:type="dxa"/>
+              <w:bottom w:w="70" w:type="dxa"/>
               <w:left w:w="120" w:type="dxa"/>
               <w:right w:w="120" w:type="dxa"/>
             </w:tcMar>
           </w:tcPr>
           <w:p>
             <w:pPr>
-              <w:spacing w:before="0" w:after="0" w:line="240" w:lineRule="exact"/>
+              <w:spacing w:before="0" w:after="0"/>
               <w:jc w:val="left"/>
             </w:pPr>
             <w:r>
@@ -687,9 +667,6 @@
     </w:tbl>
     <w:tbl>
       <w:tblPr>
-        <w:tblStyle w:val="TableGrid"/>
-        <w:tblW w:type="auto" w:w="0"/>
-        <w:jc w:val="left"/>
         <w:tblLook w:firstColumn="1" w:firstRow="1" w:lastColumn="0" w:lastRow="0" w:noHBand="0" w:noVBand="1" w:val="04A0"/>
         <w:tblBorders>
           <w:top w:val="single" w:sz="4" w:space="0" w:color="BBBBE8"/>
@@ -699,6 +676,7 @@
           <w:insideH w:val="none" w:sz="0" w:space="0" w:color="auto"/>
           <w:insideV w:val="none" w:sz="0" w:space="0" w:color="auto"/>
         </w:tblBorders>
+        <w:tblW w:w="10544" w:type="dxa"/>
       </w:tblPr>
       <w:tblGrid>
         <w:gridCol w:w="10546"/>
@@ -709,20 +687,20 @@
             <w:tcW w:type="dxa" w:w="10546"/>
             <w:shd w:val="clear" w:color="auto" w:fill="EEEEF8"/>
             <w:tcMar>
-              <w:top w:w="100" w:type="dxa"/>
-              <w:bottom w:w="100" w:type="dxa"/>
+              <w:top w:w="80" w:type="dxa"/>
+              <w:bottom w:w="80" w:type="dxa"/>
               <w:left w:w="120" w:type="dxa"/>
               <w:right w:w="120" w:type="dxa"/>
             </w:tcMar>
           </w:tcPr>
           <w:p>
             <w:pPr>
-              <w:spacing w:before="0" w:after="100" w:line="240" w:lineRule="exact"/>
+              <w:spacing w:before="0" w:after="100"/>
               <w:ind w:left="57"/>
               <w:jc w:val="left"/>
               <w:shd w:val="clear" w:color="auto" w:fill="FFF0F0"/>
               <w:pBdr>
-                <w:left w:val="single" w:sz="16" w:space="4" w:color="FF1721"/>
+                <w:left w:val="single" w:sz="12" w:space="4" w:color="FF1721"/>
               </w:pBdr>
             </w:pPr>
             <w:r>
@@ -768,7 +746,7 @@
           </w:p>
           <w:p>
             <w:pPr>
-              <w:spacing w:before="80" w:after="0" w:line="240" w:lineRule="exact"/>
+              <w:spacing w:before="80" w:after="0"/>
               <w:jc w:val="left"/>
             </w:pPr>
             <w:r>
@@ -789,12 +767,12 @@
                 <w:color w:val="343C3D"/>
                 <w:sz w:val="18"/>
               </w:rPr>
-              <w:t>Alten Freigabe-Link deaktivieren</w:t>
+              <w:t>Freigegebene Elemente identifizieren</w:t>
             </w:r>
           </w:p>
           <w:p>
             <w:pPr>
-              <w:spacing w:before="0" w:after="40" w:line="240" w:lineRule="exact"/>
+              <w:spacing w:before="0" w:after="40"/>
               <w:ind w:left="340"/>
               <w:jc w:val="left"/>
             </w:pPr>
@@ -806,12 +784,12 @@
                 <w:color w:val="343C3D"/>
                 <w:sz w:val="16"/>
               </w:rPr>
-              <w:t>In OneDrive (Web) zur geteilten Datei/Ordner navigieren → Rechtsklick → Zugriff verwalten → den alten Link entfernen oder deaktivieren.</w:t>
+              <w:t>In OneDrive Web oben auf «Geteilt» klicken → «Von mir geteilt» auswählen. Alle Elemente notieren, die mit dem alten UPN geteilt wurden.</w:t>
             </w:r>
           </w:p>
           <w:p>
             <w:pPr>
-              <w:spacing w:before="80" w:after="0" w:line="240" w:lineRule="exact"/>
+              <w:spacing w:before="80" w:after="0"/>
               <w:jc w:val="left"/>
             </w:pPr>
             <w:r>
@@ -832,12 +810,12 @@
                 <w:color w:val="343C3D"/>
                 <w:sz w:val="18"/>
               </w:rPr>
-              <w:t>Neu teilen mit neuem UPN</w:t>
+              <w:t>Freigaben entfernen und neu erstellen</w:t>
             </w:r>
           </w:p>
           <w:p>
             <w:pPr>
-              <w:spacing w:before="0" w:after="40" w:line="240" w:lineRule="exact"/>
+              <w:spacing w:before="0" w:after="40"/>
               <w:ind w:left="340"/>
               <w:jc w:val="left"/>
             </w:pPr>
@@ -849,12 +827,12 @@
                 <w:color w:val="343C3D"/>
                 <w:sz w:val="16"/>
               </w:rPr>
-              <w:t>Erneut auf «Teilen» klicken und die neue geschäftliche E-Mail-Adresse als Absender-Konto verwenden. Empfänger per E-Mail neu einladen.</w:t>
+              <w:t>Für jedes Element: Rechtsklick → «Freigabe verwalten» → bestehende Freigaben entfernen → neu teilen mit der neuen E-Mail-Adresse der Empfänger.</w:t>
             </w:r>
           </w:p>
           <w:p>
             <w:pPr>
-              <w:spacing w:before="80" w:after="0" w:line="240" w:lineRule="exact"/>
+              <w:spacing w:before="80" w:after="0"/>
               <w:jc w:val="left"/>
             </w:pPr>
             <w:r>
@@ -875,12 +853,12 @@
                 <w:color w:val="343C3D"/>
                 <w:sz w:val="18"/>
               </w:rPr>
-              <w:t>Bestätigung einholen</w:t>
+              <w:t>Empfänger informieren</w:t>
             </w:r>
           </w:p>
           <w:p>
             <w:pPr>
-              <w:spacing w:before="0" w:after="40" w:line="240" w:lineRule="exact"/>
+              <w:spacing w:before="0" w:after="40"/>
               <w:ind w:left="340"/>
               <w:jc w:val="left"/>
             </w:pPr>
@@ -892,7 +870,7 @@
                 <w:color w:val="343C3D"/>
                 <w:sz w:val="16"/>
               </w:rPr>
-              <w:t>Sicherstellen, dass Empfänger den neuen Link erhalten haben und Zugriff funktioniert. Bei Problemen IT-Team kontaktieren.</w:t>
+              <w:t>Empfänger über die neuen Freigabe-Links informieren. Die alten Links funktionieren nicht mehr.</w:t>
             </w:r>
           </w:p>
         </w:tc>
@@ -900,18 +878,15 @@
     </w:tbl>
     <w:p>
       <w:pPr>
-        <w:spacing w:before="0" w:after="0" w:line="80" w:lineRule="exact"/>
+        <w:spacing w:line="80" w:lineRule="exact"/>
+        <w:rPr>
+          <w:sz w:val="2"/>
+        </w:rPr>
       </w:pPr>
-      <w:r>
-        <w:rPr>
-          <w:rFonts w:ascii="Arial" w:hAnsi="Arial"/>
-          <w:sz w:val="8"/>
-        </w:rPr>
-      </w:r>
     </w:p>
     <w:p>
       <w:pPr>
-        <w:spacing w:before="80" w:after="0" w:line="240" w:lineRule="exact"/>
+        <w:spacing w:before="80" w:after="0"/>
         <w:jc w:val="center"/>
         <w:pBdr>
           <w:top w:val="single" w:sz="4" w:space="4" w:color="CCCCCC"/>

</xml_diff>